<commit_message>
Yandex Direct report: auto block 9 (minus words, keywords, RSYA bans)
Co-authored-by: Igor-Lark <Igor-Lark@users.noreply.github.com>
</commit_message>
<xml_diff>
--- a/reports/yandex-direct/2026-07-26_medvedy1968_Термопанели_Выборг_анализ.docx
+++ b/reports/yandex-direct/2026-07-26_medvedy1968_Термопанели_Выборг_анализ.docx
@@ -22,7 +22,7 @@
         <w:br/>
         <w:t>Источник: 2026-07-26_19-00-25_medvedy1968_2115.csv</w:t>
         <w:br/>
-        <w:t>Дата отчёта: 26.07.2026 16:07</w:t>
+        <w:t>Дата отчёта: 26.07.2026 16:29</w:t>
       </w:r>
     </w:p>
     <w:p>
@@ -771,7 +771,7 @@
     </w:p>
     <w:p>
       <w:r>
-        <w:t>Все платные клики пришли с поиска Яндекса (площадка yandex). Ниже — запросы, на которых был расход.</w:t>
+        <w:t>Запросы, на которых был расход (как правило, поиск Яндекса).</w:t>
       </w:r>
     </w:p>
     <w:tbl>
@@ -1725,12 +1725,12 @@
         <w:pStyle w:val="Heading1"/>
       </w:pPr>
       <w:r>
-        <w:t>5. Сети (РСЯ) — показы без расхода</w:t>
+        <w:t>5. Сети (РСЯ)</w:t>
       </w:r>
     </w:p>
     <w:p>
       <w:r>
-        <w:t>За период: 2172 показов и 59 кликов в блоке «Сети», расход 0 ₽. Это автотargeting на приложениях и сайтах партнёров — для B2B-термопанелей часть площадок (игры, погода, Дзен) малорелевантна. Рекомендуется проверить список площадок и запретить мусорные.</w:t>
+        <w:t>За период: 2172 показов, 59 кликов, расход 0.00 ₽. Список площадок к отключению — в разделе 9.6.</w:t>
       </w:r>
     </w:p>
     <w:tbl>
@@ -2866,7 +2866,7 @@
         <w:pStyle w:val="ListBullet"/>
       </w:pPr>
       <w:r>
-        <w:t>Бюджет 580 ₽ за период дал 6 конверсий (CPA ≈ 97 ₽) — для оценки качества нужны цели в Метрике и сравнение с LTV заявки.</w:t>
+        <w:t>Бюджет 580 ₽ за период дал 6 конверсий (CPA ≈ 97 ₽) — сверьте цели в Метрике с реальными заявками.</w:t>
       </w:r>
     </w:p>
     <w:p>
@@ -2874,7 +2874,7 @@
         <w:pStyle w:val="ListBullet"/>
       </w:pPr>
       <w:r>
-        <w:t>Основной расход: группы «Термопанели (транз)», «Гео (ключевая)», коммерческая и «Лен. область». Группа «клинкер (продуктовая)» — клики без расхода (вероятно только РСЯ/автотarget).</w:t>
+        <w:t>На поиске весь расход идёт через «Автотаргетинг» — добавьте ключевые фразы (фразовое/точное соответствие) и сузьте или отключите широкий автотаргет.</w:t>
       </w:r>
     </w:p>
     <w:p>
@@ -2882,7 +2882,7 @@
         <w:pStyle w:val="ListBullet"/>
       </w:pPr>
       <w:r>
-        <w:t>Лучший заголовок по конверсиям и расходу: «Бесплатная доставка по Выборгскому району» (≈290 ₽, 3 конверсии).</w:t>
+        <w:t>Часть трафика с поиска — запросы к сторонним магазинам (Петрович, Вимос); см. раздел 9.</w:t>
       </w:r>
     </w:p>
     <w:p>
@@ -2890,7 +2890,7 @@
         <w:pStyle w:val="ListBullet"/>
       </w:pPr>
       <w:r>
-        <w:t>Часть платных запросов — не про термопанели («петрович выборг», «строительный магазин вимос»). Имеет смысл минус-слова (петрович, вимос, стройбаза, строительный магазин) и ужесточение автотargeting / переход на ключевые фразы.</w:t>
+        <w:t>Целевые платные запросы («термопанели», «фасадные панели…») — оставить и усилить ключами из раздела 9.5.</w:t>
       </w:r>
     </w:p>
     <w:p>
@@ -2898,7 +2898,7 @@
         <w:pStyle w:val="ListBullet"/>
       </w:pPr>
       <w:r>
-        <w:t>Запрос «термопанели» и «фасадные панели для наружной отделки» — целевые, оставить и масштабировать при приемлемом CPA.</w:t>
+        <w:t>РСЯ: отключить или запретить площадки из раздела 9.6 (Дзен, игры, погода).</w:t>
       </w:r>
     </w:p>
     <w:p>
@@ -2906,15 +2906,7 @@
         <w:pStyle w:val="ListBullet"/>
       </w:pPr>
       <w:r>
-        <w:t>РСЯ: много показов на dzen.ru, mail.ru, игровых приложениях — для строительного B2B лучше снизить долю сетей или отключить нецелевые площадки.</w:t>
-      </w:r>
-    </w:p>
-    <w:p>
-      <w:pPr>
-        <w:pStyle w:val="ListBullet"/>
-      </w:pPr>
-      <w:r>
-        <w:t>Проверить, что все 6 конверсий — целевые (заявка/звонок), и настроить офлайн-конверсии и коллтрекинг.</w:t>
+        <w:t>Масштабировать объявления с сильным CPA/конверсиями (см. раздел 4).</w:t>
       </w:r>
     </w:p>
     <w:p>
@@ -2927,7 +2919,1495 @@
     </w:p>
     <w:p>
       <w:r>
-        <w:t>Отчёт построен автоматически из выгрузки «Мaster report» Директа (детализация по дням, группам, запросам, площадкам). Строка «Итого» в CSV использована для сверки KPI.</w:t>
+        <w:t>Отчёт: scripts/yandex_direct_report_docx.py — Master report Директа. Раздел 9 (минус-слова, ключи, площадки) добавляется при каждом запуске анализа.</w:t>
+      </w:r>
+    </w:p>
+    <w:p>
+      <w:pPr>
+        <w:pStyle w:val="Heading1"/>
+      </w:pPr>
+      <w:r>
+        <w:t>9. Минус-слова, ключевые фразы, площадки к отключению</w:t>
+      </w:r>
+    </w:p>
+    <w:p>
+      <w:r>
+        <w:t>Блок формируется автоматически при каждом анализе: базовые списки для ниши фасадов/термопанелей + данные из вашей выгрузки (запросы и площадки РСЯ).</w:t>
+      </w:r>
+    </w:p>
+    <w:p>
+      <w:pPr>
+        <w:pStyle w:val="Heading2"/>
+      </w:pPr>
+      <w:r>
+        <w:t>9.1. Минус-слова (уровень кампании)</w:t>
+      </w:r>
+    </w:p>
+    <w:p>
+      <w:r>
+        <w:t>Скопировать в Директ (по одному слову на строку):</w:t>
+      </w:r>
+    </w:p>
+    <w:p>
+      <w:r>
+        <w:rPr>
+          <w:rFonts w:ascii="Consolas" w:hAnsi="Consolas"/>
+        </w:rPr>
+        <w:t>dns</w:t>
+        <w:br/>
+        <w:t>leroy</w:t>
+        <w:br/>
+        <w:t>maxidom</w:t>
+        <w:br/>
+        <w:t>mvideo</w:t>
+        <w:br/>
+        <w:t>obi</w:t>
+        <w:br/>
+        <w:t>youtube</w:t>
+        <w:br/>
+        <w:t>авito</w:t>
+        <w:br/>
+        <w:t>б/у</w:t>
+        <w:br/>
+        <w:t>вакансии</w:t>
+        <w:br/>
+        <w:t>вимос</w:t>
+        <w:br/>
+        <w:t>виниловый сайдинг</w:t>
+        <w:br/>
+        <w:t>гипермаркет</w:t>
+        <w:br/>
+        <w:t>кастorama</w:t>
+        <w:br/>
+        <w:t>каталог</w:t>
+        <w:br/>
+        <w:t>леруа</w:t>
+        <w:br/>
+        <w:t>максидом</w:t>
+        <w:br/>
+        <w:t>метр</w:t>
+        <w:br/>
+        <w:t>новгород</w:t>
+        <w:br/>
+        <w:t>оби</w:t>
+        <w:br/>
+        <w:t>официальный сайт</w:t>
+        <w:br/>
+        <w:t>пвх</w:t>
+        <w:br/>
+        <w:t>петрович</w:t>
+        <w:br/>
+        <w:t>распродажа</w:t>
+        <w:br/>
+        <w:t>рассрочка</w:t>
+        <w:br/>
+        <w:t>сайдинг винил</w:t>
+        <w:br/>
+        <w:t>скачать</w:t>
+        <w:br/>
+        <w:t>строим наш дом</w:t>
+        <w:br/>
+        <w:t>стройбаза</w:t>
+        <w:br/>
+        <w:t>строймагазин</w:t>
+        <w:br/>
+        <w:t>форум</w:t>
+        <w:br/>
+        <w:t>ютуб</w:t>
+      </w:r>
+    </w:p>
+    <w:p>
+      <w:pPr>
+        <w:pStyle w:val="Heading2"/>
+      </w:pPr>
+      <w:r>
+        <w:t>9.2. Минус-фразы</w:t>
+      </w:r>
+    </w:p>
+    <w:p>
+      <w:r>
+        <w:t>Рекомендуемые минус-фразы:</w:t>
+      </w:r>
+    </w:p>
+    <w:p>
+      <w:r>
+        <w:rPr>
+          <w:rFonts w:ascii="Consolas" w:hAnsi="Consolas"/>
+        </w:rPr>
+        <w:t>петрович выборг</w:t>
+        <w:br/>
+        <w:t>вимос выборг</w:t>
+        <w:br/>
+        <w:t>каталог товаров</w:t>
+        <w:br/>
+        <w:t>строительный магазин</w:t>
+        <w:br/>
+        <w:t>магазин петрович</w:t>
+      </w:r>
+    </w:p>
+    <w:p>
+      <w:pPr>
+        <w:pStyle w:val="Heading2"/>
+      </w:pPr>
+      <w:r>
+        <w:t>9.3. Опционально (если не продаёте панели без утепления)</w:t>
+      </w:r>
+    </w:p>
+    <w:p/>
+    <w:p>
+      <w:r>
+        <w:rPr>
+          <w:rFonts w:ascii="Consolas" w:hAnsi="Consolas"/>
+        </w:rPr>
+        <w:t>без утеплителя</w:t>
+        <w:br/>
+        <w:t>вентфасад плитка</w:t>
+      </w:r>
+    </w:p>
+    <w:p>
+      <w:pPr>
+        <w:pStyle w:val="Heading2"/>
+      </w:pPr>
+      <w:r>
+        <w:t>9.4. Платные запросы — отсечь</w:t>
+      </w:r>
+    </w:p>
+    <w:tbl>
+      <w:tblPr>
+        <w:tblStyle w:val="TableGrid"/>
+        <w:tblW w:type="auto" w:w="0"/>
+        <w:tblLook w:firstColumn="1" w:firstRow="1" w:lastColumn="0" w:lastRow="0" w:noHBand="0" w:noVBand="1" w:val="04A0"/>
+      </w:tblPr>
+      <w:tblGrid>
+        <w:gridCol w:w="1728"/>
+        <w:gridCol w:w="1728"/>
+        <w:gridCol w:w="1728"/>
+        <w:gridCol w:w="1728"/>
+        <w:gridCol w:w="1728"/>
+      </w:tblGrid>
+      <w:tr>
+        <w:tc>
+          <w:tcPr>
+            <w:tcW w:type="dxa" w:w="1728"/>
+          </w:tcPr>
+          <w:p>
+            <w:r>
+              <w:t>Запрос</w:t>
+            </w:r>
+          </w:p>
+        </w:tc>
+        <w:tc>
+          <w:tcPr>
+            <w:tcW w:type="dxa" w:w="1728"/>
+          </w:tcPr>
+          <w:p>
+            <w:r>
+              <w:t>₽</w:t>
+            </w:r>
+          </w:p>
+        </w:tc>
+        <w:tc>
+          <w:tcPr>
+            <w:tcW w:type="dxa" w:w="1728"/>
+          </w:tcPr>
+          <w:p>
+            <w:r>
+              <w:t>Клики</w:t>
+            </w:r>
+          </w:p>
+        </w:tc>
+        <w:tc>
+          <w:tcPr>
+            <w:tcW w:type="dxa" w:w="1728"/>
+          </w:tcPr>
+          <w:p>
+            <w:r>
+              <w:t>Конв.</w:t>
+            </w:r>
+          </w:p>
+        </w:tc>
+        <w:tc>
+          <w:tcPr>
+            <w:tcW w:type="dxa" w:w="1728"/>
+          </w:tcPr>
+          <w:p>
+            <w:r>
+              <w:t>Действие</w:t>
+            </w:r>
+          </w:p>
+        </w:tc>
+      </w:tr>
+      <w:tr>
+        <w:tc>
+          <w:tcPr>
+            <w:tcW w:type="dxa" w:w="1728"/>
+          </w:tcPr>
+          <w:p>
+            <w:r>
+              <w:t>петрович выборг</w:t>
+            </w:r>
+          </w:p>
+        </w:tc>
+        <w:tc>
+          <w:tcPr>
+            <w:tcW w:type="dxa" w:w="1728"/>
+          </w:tcPr>
+          <w:p>
+            <w:r>
+              <w:t>100</w:t>
+            </w:r>
+          </w:p>
+        </w:tc>
+        <w:tc>
+          <w:tcPr>
+            <w:tcW w:type="dxa" w:w="1728"/>
+          </w:tcPr>
+          <w:p>
+            <w:r>
+              <w:t>11</w:t>
+            </w:r>
+          </w:p>
+        </w:tc>
+        <w:tc>
+          <w:tcPr>
+            <w:tcW w:type="dxa" w:w="1728"/>
+          </w:tcPr>
+          <w:p>
+            <w:r>
+              <w:t>1</w:t>
+            </w:r>
+          </w:p>
+        </w:tc>
+        <w:tc>
+          <w:tcPr>
+            <w:tcW w:type="dxa" w:w="1728"/>
+          </w:tcPr>
+          <w:p>
+            <w:r>
+              <w:t>в минус-фразы</w:t>
+            </w:r>
+          </w:p>
+        </w:tc>
+      </w:tr>
+      <w:tr>
+        <w:tc>
+          <w:tcPr>
+            <w:tcW w:type="dxa" w:w="1728"/>
+          </w:tcPr>
+          <w:p>
+            <w:r>
+              <w:t>строительный магазин вимос</w:t>
+            </w:r>
+          </w:p>
+        </w:tc>
+        <w:tc>
+          <w:tcPr>
+            <w:tcW w:type="dxa" w:w="1728"/>
+          </w:tcPr>
+          <w:p>
+            <w:r>
+              <w:t>190</w:t>
+            </w:r>
+          </w:p>
+        </w:tc>
+        <w:tc>
+          <w:tcPr>
+            <w:tcW w:type="dxa" w:w="1728"/>
+          </w:tcPr>
+          <w:p>
+            <w:r>
+              <w:t>3</w:t>
+            </w:r>
+          </w:p>
+        </w:tc>
+        <w:tc>
+          <w:tcPr>
+            <w:tcW w:type="dxa" w:w="1728"/>
+          </w:tcPr>
+          <w:p>
+            <w:r>
+              <w:t>2</w:t>
+            </w:r>
+          </w:p>
+        </w:tc>
+        <w:tc>
+          <w:tcPr>
+            <w:tcW w:type="dxa" w:w="1728"/>
+          </w:tcPr>
+          <w:p>
+            <w:r>
+              <w:t>в минус-фразы</w:t>
+            </w:r>
+          </w:p>
+        </w:tc>
+      </w:tr>
+    </w:tbl>
+    <w:p/>
+    <w:p>
+      <w:pPr>
+        <w:pStyle w:val="Heading2"/>
+      </w:pPr>
+      <w:r>
+        <w:t>9.5. Ключевые фразы по группам</w:t>
+      </w:r>
+    </w:p>
+    <w:p>
+      <w:r>
+        <w:t>На поиске весь расход идёт через «Автотаргетинг» — добавьте ключевые фразы (фразовое/точное соответствие) и сузьте или отключите широкий автотаргет.</w:t>
+      </w:r>
+    </w:p>
+    <w:p>
+      <w:pPr>
+        <w:pStyle w:val="ListBullet"/>
+      </w:pPr>
+      <w:r>
+        <w:t>Группа: Группа 1 - коммерческая</w:t>
+      </w:r>
+    </w:p>
+    <w:p/>
+    <w:p>
+      <w:r>
+        <w:rPr>
+          <w:rFonts w:ascii="Consolas" w:hAnsi="Consolas"/>
+        </w:rPr>
+        <w:t>термопанели</w:t>
+        <w:br/>
+        <w:t>термопанели купить</w:t>
+        <w:br/>
+        <w:t>термопанели цена</w:t>
+        <w:br/>
+        <w:t>термопанели для фасада</w:t>
+        <w:br/>
+        <w:t>фасадные панели с утеплением</w:t>
+        <w:br/>
+        <w:t>фасадные панели для наружной отделки</w:t>
+        <w:br/>
+        <w:t>купить термопанели</w:t>
+        <w:br/>
+        <w:t>термопанели от производителя</w:t>
+      </w:r>
+    </w:p>
+    <w:p>
+      <w:pPr>
+        <w:pStyle w:val="ListBullet"/>
+      </w:pPr>
+      <w:r>
+        <w:t>Группа: Группа 2 - Гео (ключевая)</w:t>
+      </w:r>
+    </w:p>
+    <w:p/>
+    <w:p>
+      <w:r>
+        <w:rPr>
+          <w:rFonts w:ascii="Consolas" w:hAnsi="Consolas"/>
+        </w:rPr>
+        <w:t>термопанели выборг</w:t>
+        <w:br/>
+        <w:t>термопанели в выборге</w:t>
+        <w:br/>
+        <w:t>фасадные панели выборг</w:t>
+        <w:br/>
+        <w:t>клинкерные термопанели выборг</w:t>
+        <w:br/>
+        <w:t>термопанели выборгский район</w:t>
+        <w:br/>
+        <w:t>утепление фасада выборг</w:t>
+      </w:r>
+    </w:p>
+    <w:p>
+      <w:pPr>
+        <w:pStyle w:val="ListBullet"/>
+      </w:pPr>
+      <w:r>
+        <w:t>Группа: Группа 3 - клинкер (продуктовая)</w:t>
+      </w:r>
+    </w:p>
+    <w:p/>
+    <w:p>
+      <w:r>
+        <w:rPr>
+          <w:rFonts w:ascii="Consolas" w:hAnsi="Consolas"/>
+        </w:rPr>
+        <w:t>клинкерные термопанели</w:t>
+        <w:br/>
+        <w:t>термопанели под кирпич</w:t>
+        <w:br/>
+        <w:t>фасад под кирпич термопанели</w:t>
+        <w:br/>
+        <w:t>клинкерные панели для фасада</w:t>
+        <w:br/>
+        <w:t>термопанель кирпич фасад</w:t>
+      </w:r>
+    </w:p>
+    <w:p>
+      <w:pPr>
+        <w:pStyle w:val="ListBullet"/>
+      </w:pPr>
+      <w:r>
+        <w:t>Группа: Термопанели (Лен. область)</w:t>
+      </w:r>
+    </w:p>
+    <w:p/>
+    <w:p>
+      <w:r>
+        <w:rPr>
+          <w:rFonts w:ascii="Consolas" w:hAnsi="Consolas"/>
+        </w:rPr>
+        <w:t>термопанели производство ленобласть</w:t>
+        <w:br/>
+        <w:t>фасадные термопанели ленинградская область</w:t>
+      </w:r>
+    </w:p>
+    <w:p>
+      <w:pPr>
+        <w:pStyle w:val="ListBullet"/>
+      </w:pPr>
+      <w:r>
+        <w:t>Группа: Термопанели (транз)</w:t>
+      </w:r>
+    </w:p>
+    <w:p/>
+    <w:p>
+      <w:r>
+        <w:rPr>
+          <w:rFonts w:ascii="Consolas" w:hAnsi="Consolas"/>
+        </w:rPr>
+        <w:t>термопанели ленинградская область</w:t>
+        <w:br/>
+        <w:t>термопанели ленобласть</w:t>
+        <w:br/>
+        <w:t>термопанели с доставкой</w:t>
+        <w:br/>
+        <w:t>термопанели приозерск</w:t>
+        <w:br/>
+        <w:t>термопанели всеволожский район</w:t>
+      </w:r>
+    </w:p>
+    <w:p>
+      <w:pPr>
+        <w:pStyle w:val="ListBullet"/>
+      </w:pPr>
+      <w:r>
+        <w:t>Группа: Из отчёта (целевые запросы с кликами)</w:t>
+      </w:r>
+    </w:p>
+    <w:p/>
+    <w:p>
+      <w:r>
+        <w:rPr>
+          <w:rFonts w:ascii="Consolas" w:hAnsi="Consolas"/>
+        </w:rPr>
+        <w:t>термопанели для наружной отделки дома цена</w:t>
+        <w:br/>
+        <w:t>фасадные панели для наружной отделки дома</w:t>
+        <w:br/>
+        <w:t>термопанели фасадные способ монтажа на осп</w:t>
+        <w:br/>
+        <w:t>термопанели из белоруссии</w:t>
+        <w:br/>
+        <w:t>плитка клинкерная вентфасад</w:t>
+        <w:br/>
+        <w:t>клинкерные панели для фасада баварская кладка</w:t>
+        <w:br/>
+        <w:t>термопанели производство в ленобласти в отрадном</w:t>
+        <w:br/>
+        <w:t>ул загородная колпино производство термопанелей</w:t>
+        <w:br/>
+        <w:t>как устанавливаются фасадные термопанели</w:t>
+        <w:br/>
+        <w:t>как установить термопанели на неровные стены</w:t>
+        <w:br/>
+        <w:t>утепление дома сип панелями снаружи</w:t>
+        <w:br/>
+        <w:t>как утеплить цоколь дома на сваях</w:t>
+      </w:r>
+    </w:p>
+    <w:p>
+      <w:pPr>
+        <w:pStyle w:val="Heading2"/>
+      </w:pPr>
+      <w:r>
+        <w:t>9.6. Площадки РСЯ — убрать из показов</w:t>
+      </w:r>
+    </w:p>
+    <w:p>
+      <w:r>
+        <w:t>В интерфейсе Директа: кампания → «Площадки» → «Запретить площадки» (или снизить/отключить показы в сетях). Ниже — площадки из отчёта с признаками нерелевантности для B2B-термопанелей.</w:t>
+      </w:r>
+    </w:p>
+    <w:tbl>
+      <w:tblPr>
+        <w:tblStyle w:val="TableGrid"/>
+        <w:tblW w:type="auto" w:w="0"/>
+        <w:tblLook w:firstColumn="1" w:firstRow="1" w:lastColumn="0" w:lastRow="0" w:noHBand="0" w:noVBand="1" w:val="04A0"/>
+      </w:tblPr>
+      <w:tblGrid>
+        <w:gridCol w:w="1728"/>
+        <w:gridCol w:w="1728"/>
+        <w:gridCol w:w="1728"/>
+        <w:gridCol w:w="1728"/>
+        <w:gridCol w:w="1728"/>
+      </w:tblGrid>
+      <w:tr>
+        <w:tc>
+          <w:tcPr>
+            <w:tcW w:type="dxa" w:w="1728"/>
+          </w:tcPr>
+          <w:p>
+            <w:r>
+              <w:t>Площадка</w:t>
+            </w:r>
+          </w:p>
+        </w:tc>
+        <w:tc>
+          <w:tcPr>
+            <w:tcW w:type="dxa" w:w="1728"/>
+          </w:tcPr>
+          <w:p>
+            <w:r>
+              <w:t>Показы</w:t>
+            </w:r>
+          </w:p>
+        </w:tc>
+        <w:tc>
+          <w:tcPr>
+            <w:tcW w:type="dxa" w:w="1728"/>
+          </w:tcPr>
+          <w:p>
+            <w:r>
+              <w:t>Клики</w:t>
+            </w:r>
+          </w:p>
+        </w:tc>
+        <w:tc>
+          <w:tcPr>
+            <w:tcW w:type="dxa" w:w="1728"/>
+          </w:tcPr>
+          <w:p>
+            <w:r>
+              <w:t>Конв.</w:t>
+            </w:r>
+          </w:p>
+        </w:tc>
+        <w:tc>
+          <w:tcPr>
+            <w:tcW w:type="dxa" w:w="1728"/>
+          </w:tcPr>
+          <w:p>
+            <w:r>
+              <w:t>Причина</w:t>
+            </w:r>
+          </w:p>
+        </w:tc>
+      </w:tr>
+      <w:tr>
+        <w:tc>
+          <w:tcPr>
+            <w:tcW w:type="dxa" w:w="1728"/>
+          </w:tcPr>
+          <w:p>
+            <w:r>
+              <w:t>dzen.ru</w:t>
+            </w:r>
+          </w:p>
+        </w:tc>
+        <w:tc>
+          <w:tcPr>
+            <w:tcW w:type="dxa" w:w="1728"/>
+          </w:tcPr>
+          <w:p>
+            <w:r>
+              <w:t>829</w:t>
+            </w:r>
+          </w:p>
+        </w:tc>
+        <w:tc>
+          <w:tcPr>
+            <w:tcW w:type="dxa" w:w="1728"/>
+          </w:tcPr>
+          <w:p>
+            <w:r>
+              <w:t>18</w:t>
+            </w:r>
+          </w:p>
+        </w:tc>
+        <w:tc>
+          <w:tcPr>
+            <w:tcW w:type="dxa" w:w="1728"/>
+          </w:tcPr>
+          <w:p>
+            <w:r>
+              <w:t>0</w:t>
+            </w:r>
+          </w:p>
+        </w:tc>
+        <w:tc>
+          <w:tcPr>
+            <w:tcW w:type="dxa" w:w="1728"/>
+          </w:tcPr>
+          <w:p>
+            <w:r>
+              <w:t>игры/Дзен/погода/соцсети; клики без конверсий</w:t>
+            </w:r>
+          </w:p>
+        </w:tc>
+      </w:tr>
+      <w:tr>
+        <w:tc>
+          <w:tcPr>
+            <w:tcW w:type="dxa" w:w="1728"/>
+          </w:tcPr>
+          <w:p>
+            <w:r>
+              <w:t>kidultlovin.word.zen</w:t>
+            </w:r>
+          </w:p>
+        </w:tc>
+        <w:tc>
+          <w:tcPr>
+            <w:tcW w:type="dxa" w:w="1728"/>
+          </w:tcPr>
+          <w:p>
+            <w:r>
+              <w:t>32</w:t>
+            </w:r>
+          </w:p>
+        </w:tc>
+        <w:tc>
+          <w:tcPr>
+            <w:tcW w:type="dxa" w:w="1728"/>
+          </w:tcPr>
+          <w:p>
+            <w:r>
+              <w:t>6</w:t>
+            </w:r>
+          </w:p>
+        </w:tc>
+        <w:tc>
+          <w:tcPr>
+            <w:tcW w:type="dxa" w:w="1728"/>
+          </w:tcPr>
+          <w:p>
+            <w:r>
+              <w:t>0</w:t>
+            </w:r>
+          </w:p>
+        </w:tc>
+        <w:tc>
+          <w:tcPr>
+            <w:tcW w:type="dxa" w:w="1728"/>
+          </w:tcPr>
+          <w:p>
+            <w:r>
+              <w:t>игры/Дзен/погода/соцсети; клики без конверсий</w:t>
+            </w:r>
+          </w:p>
+        </w:tc>
+      </w:tr>
+      <w:tr>
+        <w:tc>
+          <w:tcPr>
+            <w:tcW w:type="dxa" w:w="1728"/>
+          </w:tcPr>
+          <w:p>
+            <w:r>
+              <w:t>yandex.ru</w:t>
+            </w:r>
+          </w:p>
+        </w:tc>
+        <w:tc>
+          <w:tcPr>
+            <w:tcW w:type="dxa" w:w="1728"/>
+          </w:tcPr>
+          <w:p>
+            <w:r>
+              <w:t>51</w:t>
+            </w:r>
+          </w:p>
+        </w:tc>
+        <w:tc>
+          <w:tcPr>
+            <w:tcW w:type="dxa" w:w="1728"/>
+          </w:tcPr>
+          <w:p>
+            <w:r>
+              <w:t>5</w:t>
+            </w:r>
+          </w:p>
+        </w:tc>
+        <w:tc>
+          <w:tcPr>
+            <w:tcW w:type="dxa" w:w="1728"/>
+          </w:tcPr>
+          <w:p>
+            <w:r>
+              <w:t>0</w:t>
+            </w:r>
+          </w:p>
+        </w:tc>
+        <w:tc>
+          <w:tcPr>
+            <w:tcW w:type="dxa" w:w="1728"/>
+          </w:tcPr>
+          <w:p>
+            <w:r>
+              <w:t>клики без конверсий</w:t>
+            </w:r>
+          </w:p>
+        </w:tc>
+      </w:tr>
+      <w:tr>
+        <w:tc>
+          <w:tcPr>
+            <w:tcW w:type="dxa" w:w="1728"/>
+          </w:tcPr>
+          <w:p>
+            <w:r>
+              <w:t>com.oakever.tiletrip</w:t>
+            </w:r>
+          </w:p>
+        </w:tc>
+        <w:tc>
+          <w:tcPr>
+            <w:tcW w:type="dxa" w:w="1728"/>
+          </w:tcPr>
+          <w:p>
+            <w:r>
+              <w:t>15</w:t>
+            </w:r>
+          </w:p>
+        </w:tc>
+        <w:tc>
+          <w:tcPr>
+            <w:tcW w:type="dxa" w:w="1728"/>
+          </w:tcPr>
+          <w:p>
+            <w:r>
+              <w:t>5</w:t>
+            </w:r>
+          </w:p>
+        </w:tc>
+        <w:tc>
+          <w:tcPr>
+            <w:tcW w:type="dxa" w:w="1728"/>
+          </w:tcPr>
+          <w:p>
+            <w:r>
+              <w:t>0</w:t>
+            </w:r>
+          </w:p>
+        </w:tc>
+        <w:tc>
+          <w:tcPr>
+            <w:tcW w:type="dxa" w:w="1728"/>
+          </w:tcPr>
+          <w:p>
+            <w:r>
+              <w:t>игры/Дзен/погода/соцсети; мобильное приложение; клики без конверсий</w:t>
+            </w:r>
+          </w:p>
+        </w:tc>
+      </w:tr>
+      <w:tr>
+        <w:tc>
+          <w:tcPr>
+            <w:tcW w:type="dxa" w:w="1728"/>
+          </w:tcPr>
+          <w:p>
+            <w:r>
+              <w:t>com.dream.free.games.match3</w:t>
+            </w:r>
+          </w:p>
+        </w:tc>
+        <w:tc>
+          <w:tcPr>
+            <w:tcW w:type="dxa" w:w="1728"/>
+          </w:tcPr>
+          <w:p>
+            <w:r>
+              <w:t>5</w:t>
+            </w:r>
+          </w:p>
+        </w:tc>
+        <w:tc>
+          <w:tcPr>
+            <w:tcW w:type="dxa" w:w="1728"/>
+          </w:tcPr>
+          <w:p>
+            <w:r>
+              <w:t>4</w:t>
+            </w:r>
+          </w:p>
+        </w:tc>
+        <w:tc>
+          <w:tcPr>
+            <w:tcW w:type="dxa" w:w="1728"/>
+          </w:tcPr>
+          <w:p>
+            <w:r>
+              <w:t>0</w:t>
+            </w:r>
+          </w:p>
+        </w:tc>
+        <w:tc>
+          <w:tcPr>
+            <w:tcW w:type="dxa" w:w="1728"/>
+          </w:tcPr>
+          <w:p>
+            <w:r>
+              <w:t>игры/Дзен/погода/соцсети; мобильное приложение; клики без конверсий</w:t>
+            </w:r>
+          </w:p>
+        </w:tc>
+      </w:tr>
+      <w:tr>
+        <w:tc>
+          <w:tcPr>
+            <w:tcW w:type="dxa" w:w="1728"/>
+          </w:tcPr>
+          <w:p>
+            <w:r>
+              <w:t>m.pogoda.yandex.ru</w:t>
+            </w:r>
+          </w:p>
+        </w:tc>
+        <w:tc>
+          <w:tcPr>
+            <w:tcW w:type="dxa" w:w="1728"/>
+          </w:tcPr>
+          <w:p>
+            <w:r>
+              <w:t>100</w:t>
+            </w:r>
+          </w:p>
+        </w:tc>
+        <w:tc>
+          <w:tcPr>
+            <w:tcW w:type="dxa" w:w="1728"/>
+          </w:tcPr>
+          <w:p>
+            <w:r>
+              <w:t>3</w:t>
+            </w:r>
+          </w:p>
+        </w:tc>
+        <w:tc>
+          <w:tcPr>
+            <w:tcW w:type="dxa" w:w="1728"/>
+          </w:tcPr>
+          <w:p>
+            <w:r>
+              <w:t>0</w:t>
+            </w:r>
+          </w:p>
+        </w:tc>
+        <w:tc>
+          <w:tcPr>
+            <w:tcW w:type="dxa" w:w="1728"/>
+          </w:tcPr>
+          <w:p>
+            <w:r>
+              <w:t>игры/Дзен/погода/соцсети; клики без конверсий</w:t>
+            </w:r>
+          </w:p>
+        </w:tc>
+      </w:tr>
+      <w:tr>
+        <w:tc>
+          <w:tcPr>
+            <w:tcW w:type="dxa" w:w="1728"/>
+          </w:tcPr>
+          <w:p>
+            <w:r>
+              <w:t>ru.yandex.weatherplugin</w:t>
+            </w:r>
+          </w:p>
+        </w:tc>
+        <w:tc>
+          <w:tcPr>
+            <w:tcW w:type="dxa" w:w="1728"/>
+          </w:tcPr>
+          <w:p>
+            <w:r>
+              <w:t>31</w:t>
+            </w:r>
+          </w:p>
+        </w:tc>
+        <w:tc>
+          <w:tcPr>
+            <w:tcW w:type="dxa" w:w="1728"/>
+          </w:tcPr>
+          <w:p>
+            <w:r>
+              <w:t>2</w:t>
+            </w:r>
+          </w:p>
+        </w:tc>
+        <w:tc>
+          <w:tcPr>
+            <w:tcW w:type="dxa" w:w="1728"/>
+          </w:tcPr>
+          <w:p>
+            <w:r>
+              <w:t>0</w:t>
+            </w:r>
+          </w:p>
+        </w:tc>
+        <w:tc>
+          <w:tcPr>
+            <w:tcW w:type="dxa" w:w="1728"/>
+          </w:tcPr>
+          <w:p>
+            <w:r>
+              <w:t>игры/Дзен/погода/соцсети</w:t>
+            </w:r>
+          </w:p>
+        </w:tc>
+      </w:tr>
+      <w:tr>
+        <w:tc>
+          <w:tcPr>
+            <w:tcW w:type="dxa" w:w="1728"/>
+          </w:tcPr>
+          <w:p>
+            <w:r>
+              <w:t>puzzle.blockpuzzle.cube.relax</w:t>
+            </w:r>
+          </w:p>
+        </w:tc>
+        <w:tc>
+          <w:tcPr>
+            <w:tcW w:type="dxa" w:w="1728"/>
+          </w:tcPr>
+          <w:p>
+            <w:r>
+              <w:t>13</w:t>
+            </w:r>
+          </w:p>
+        </w:tc>
+        <w:tc>
+          <w:tcPr>
+            <w:tcW w:type="dxa" w:w="1728"/>
+          </w:tcPr>
+          <w:p>
+            <w:r>
+              <w:t>2</w:t>
+            </w:r>
+          </w:p>
+        </w:tc>
+        <w:tc>
+          <w:tcPr>
+            <w:tcW w:type="dxa" w:w="1728"/>
+          </w:tcPr>
+          <w:p>
+            <w:r>
+              <w:t>0</w:t>
+            </w:r>
+          </w:p>
+        </w:tc>
+        <w:tc>
+          <w:tcPr>
+            <w:tcW w:type="dxa" w:w="1728"/>
+          </w:tcPr>
+          <w:p>
+            <w:r>
+              <w:t>игры/Дзен/погода/соцсети</w:t>
+            </w:r>
+          </w:p>
+        </w:tc>
+      </w:tr>
+      <w:tr>
+        <w:tc>
+          <w:tcPr>
+            <w:tcW w:type="dxa" w:w="1728"/>
+          </w:tcPr>
+          <w:p>
+            <w:r>
+              <w:t>com.miui.cleaner</w:t>
+            </w:r>
+          </w:p>
+        </w:tc>
+        <w:tc>
+          <w:tcPr>
+            <w:tcW w:type="dxa" w:w="1728"/>
+          </w:tcPr>
+          <w:p>
+            <w:r>
+              <w:t>9</w:t>
+            </w:r>
+          </w:p>
+        </w:tc>
+        <w:tc>
+          <w:tcPr>
+            <w:tcW w:type="dxa" w:w="1728"/>
+          </w:tcPr>
+          <w:p>
+            <w:r>
+              <w:t>2</w:t>
+            </w:r>
+          </w:p>
+        </w:tc>
+        <w:tc>
+          <w:tcPr>
+            <w:tcW w:type="dxa" w:w="1728"/>
+          </w:tcPr>
+          <w:p>
+            <w:r>
+              <w:t>0</w:t>
+            </w:r>
+          </w:p>
+        </w:tc>
+        <w:tc>
+          <w:tcPr>
+            <w:tcW w:type="dxa" w:w="1728"/>
+          </w:tcPr>
+          <w:p>
+            <w:r>
+              <w:t>игры/Дзен/погода/соцсети; мобильное приложение</w:t>
+            </w:r>
+          </w:p>
+        </w:tc>
+      </w:tr>
+      <w:tr>
+        <w:tc>
+          <w:tcPr>
+            <w:tcW w:type="dxa" w:w="1728"/>
+          </w:tcPr>
+          <w:p>
+            <w:r>
+              <w:t>com.vkontakte.android</w:t>
+            </w:r>
+          </w:p>
+        </w:tc>
+        <w:tc>
+          <w:tcPr>
+            <w:tcW w:type="dxa" w:w="1728"/>
+          </w:tcPr>
+          <w:p>
+            <w:r>
+              <w:t>49</w:t>
+            </w:r>
+          </w:p>
+        </w:tc>
+        <w:tc>
+          <w:tcPr>
+            <w:tcW w:type="dxa" w:w="1728"/>
+          </w:tcPr>
+          <w:p>
+            <w:r>
+              <w:t>1</w:t>
+            </w:r>
+          </w:p>
+        </w:tc>
+        <w:tc>
+          <w:tcPr>
+            <w:tcW w:type="dxa" w:w="1728"/>
+          </w:tcPr>
+          <w:p>
+            <w:r>
+              <w:t>0</w:t>
+            </w:r>
+          </w:p>
+        </w:tc>
+        <w:tc>
+          <w:tcPr>
+            <w:tcW w:type="dxa" w:w="1728"/>
+          </w:tcPr>
+          <w:p>
+            <w:r>
+              <w:t>игры/Дзен/погода/соцсети; мобильное приложение</w:t>
+            </w:r>
+          </w:p>
+        </w:tc>
+      </w:tr>
+      <w:tr>
+        <w:tc>
+          <w:tcPr>
+            <w:tcW w:type="dxa" w:w="1728"/>
+          </w:tcPr>
+          <w:p>
+            <w:r>
+              <w:t>ex.24smi.info</w:t>
+            </w:r>
+          </w:p>
+        </w:tc>
+        <w:tc>
+          <w:tcPr>
+            <w:tcW w:type="dxa" w:w="1728"/>
+          </w:tcPr>
+          <w:p>
+            <w:r>
+              <w:t>5</w:t>
+            </w:r>
+          </w:p>
+        </w:tc>
+        <w:tc>
+          <w:tcPr>
+            <w:tcW w:type="dxa" w:w="1728"/>
+          </w:tcPr>
+          <w:p>
+            <w:r>
+              <w:t>1</w:t>
+            </w:r>
+          </w:p>
+        </w:tc>
+        <w:tc>
+          <w:tcPr>
+            <w:tcW w:type="dxa" w:w="1728"/>
+          </w:tcPr>
+          <w:p>
+            <w:r>
+              <w:t>0</w:t>
+            </w:r>
+          </w:p>
+        </w:tc>
+        <w:tc>
+          <w:tcPr>
+            <w:tcW w:type="dxa" w:w="1728"/>
+          </w:tcPr>
+          <w:p>
+            <w:r>
+              <w:t>игры/Дзен/погода/соцсети</w:t>
+            </w:r>
+          </w:p>
+        </w:tc>
+      </w:tr>
+      <w:tr>
+        <w:tc>
+          <w:tcPr>
+            <w:tcW w:type="dxa" w:w="1728"/>
+          </w:tcPr>
+          <w:p>
+            <w:r>
+              <w:t>news.mail.ru</w:t>
+            </w:r>
+          </w:p>
+        </w:tc>
+        <w:tc>
+          <w:tcPr>
+            <w:tcW w:type="dxa" w:w="1728"/>
+          </w:tcPr>
+          <w:p>
+            <w:r>
+              <w:t>5</w:t>
+            </w:r>
+          </w:p>
+        </w:tc>
+        <w:tc>
+          <w:tcPr>
+            <w:tcW w:type="dxa" w:w="1728"/>
+          </w:tcPr>
+          <w:p>
+            <w:r>
+              <w:t>1</w:t>
+            </w:r>
+          </w:p>
+        </w:tc>
+        <w:tc>
+          <w:tcPr>
+            <w:tcW w:type="dxa" w:w="1728"/>
+          </w:tcPr>
+          <w:p>
+            <w:r>
+              <w:t>0</w:t>
+            </w:r>
+          </w:p>
+        </w:tc>
+        <w:tc>
+          <w:tcPr>
+            <w:tcW w:type="dxa" w:w="1728"/>
+          </w:tcPr>
+          <w:p>
+            <w:r>
+              <w:t>игры/Дзен/погода/соцсети</w:t>
+            </w:r>
+          </w:p>
+        </w:tc>
+      </w:tr>
+      <w:tr>
+        <w:tc>
+          <w:tcPr>
+            <w:tcW w:type="dxa" w:w="1728"/>
+          </w:tcPr>
+          <w:p>
+            <w:r>
+              <w:t>com.fingerlab.word.blockpuzzles</w:t>
+            </w:r>
+          </w:p>
+        </w:tc>
+        <w:tc>
+          <w:tcPr>
+            <w:tcW w:type="dxa" w:w="1728"/>
+          </w:tcPr>
+          <w:p>
+            <w:r>
+              <w:t>1</w:t>
+            </w:r>
+          </w:p>
+        </w:tc>
+        <w:tc>
+          <w:tcPr>
+            <w:tcW w:type="dxa" w:w="1728"/>
+          </w:tcPr>
+          <w:p>
+            <w:r>
+              <w:t>1</w:t>
+            </w:r>
+          </w:p>
+        </w:tc>
+        <w:tc>
+          <w:tcPr>
+            <w:tcW w:type="dxa" w:w="1728"/>
+          </w:tcPr>
+          <w:p>
+            <w:r>
+              <w:t>0</w:t>
+            </w:r>
+          </w:p>
+        </w:tc>
+        <w:tc>
+          <w:tcPr>
+            <w:tcW w:type="dxa" w:w="1728"/>
+          </w:tcPr>
+          <w:p>
+            <w:r>
+              <w:t>игры/Дзен/погода/соцсети; мобильное приложение</w:t>
+            </w:r>
+          </w:p>
+        </w:tc>
+      </w:tr>
+      <w:tr>
+        <w:tc>
+          <w:tcPr>
+            <w:tcW w:type="dxa" w:w="1728"/>
+          </w:tcPr>
+          <w:p>
+            <w:r>
+              <w:t>com.starplay.spider.fighter.openworld</w:t>
+            </w:r>
+          </w:p>
+        </w:tc>
+        <w:tc>
+          <w:tcPr>
+            <w:tcW w:type="dxa" w:w="1728"/>
+          </w:tcPr>
+          <w:p>
+            <w:r>
+              <w:t>1</w:t>
+            </w:r>
+          </w:p>
+        </w:tc>
+        <w:tc>
+          <w:tcPr>
+            <w:tcW w:type="dxa" w:w="1728"/>
+          </w:tcPr>
+          <w:p>
+            <w:r>
+              <w:t>1</w:t>
+            </w:r>
+          </w:p>
+        </w:tc>
+        <w:tc>
+          <w:tcPr>
+            <w:tcW w:type="dxa" w:w="1728"/>
+          </w:tcPr>
+          <w:p>
+            <w:r>
+              <w:t>0</w:t>
+            </w:r>
+          </w:p>
+        </w:tc>
+        <w:tc>
+          <w:tcPr>
+            <w:tcW w:type="dxa" w:w="1728"/>
+          </w:tcPr>
+          <w:p>
+            <w:r>
+              <w:t>мобильное приложение</w:t>
+            </w:r>
+          </w:p>
+        </w:tc>
+      </w:tr>
+      <w:tr>
+        <w:tc>
+          <w:tcPr>
+            <w:tcW w:type="dxa" w:w="1728"/>
+          </w:tcPr>
+          <w:p>
+            <w:r>
+              <w:t>win.mail.ru</w:t>
+            </w:r>
+          </w:p>
+        </w:tc>
+        <w:tc>
+          <w:tcPr>
+            <w:tcW w:type="dxa" w:w="1728"/>
+          </w:tcPr>
+          <w:p>
+            <w:r>
+              <w:t>120</w:t>
+            </w:r>
+          </w:p>
+        </w:tc>
+        <w:tc>
+          <w:tcPr>
+            <w:tcW w:type="dxa" w:w="1728"/>
+          </w:tcPr>
+          <w:p>
+            <w:r>
+              <w:t>0</w:t>
+            </w:r>
+          </w:p>
+        </w:tc>
+        <w:tc>
+          <w:tcPr>
+            <w:tcW w:type="dxa" w:w="1728"/>
+          </w:tcPr>
+          <w:p>
+            <w:r>
+              <w:t>0</w:t>
+            </w:r>
+          </w:p>
+        </w:tc>
+        <w:tc>
+          <w:tcPr>
+            <w:tcW w:type="dxa" w:w="1728"/>
+          </w:tcPr>
+          <w:p>
+            <w:r>
+              <w:t>игры/Дзен/погода/соцсети</w:t>
+            </w:r>
+          </w:p>
+        </w:tc>
+      </w:tr>
+      <w:tr>
+        <w:tc>
+          <w:tcPr>
+            <w:tcW w:type="dxa" w:w="1728"/>
+          </w:tcPr>
+          <w:p>
+            <w:r>
+              <w:t>com.avito.android</w:t>
+            </w:r>
+          </w:p>
+        </w:tc>
+        <w:tc>
+          <w:tcPr>
+            <w:tcW w:type="dxa" w:w="1728"/>
+          </w:tcPr>
+          <w:p>
+            <w:r>
+              <w:t>58</w:t>
+            </w:r>
+          </w:p>
+        </w:tc>
+        <w:tc>
+          <w:tcPr>
+            <w:tcW w:type="dxa" w:w="1728"/>
+          </w:tcPr>
+          <w:p>
+            <w:r>
+              <w:t>0</w:t>
+            </w:r>
+          </w:p>
+        </w:tc>
+        <w:tc>
+          <w:tcPr>
+            <w:tcW w:type="dxa" w:w="1728"/>
+          </w:tcPr>
+          <w:p>
+            <w:r>
+              <w:t>0</w:t>
+            </w:r>
+          </w:p>
+        </w:tc>
+        <w:tc>
+          <w:tcPr>
+            <w:tcW w:type="dxa" w:w="1728"/>
+          </w:tcPr>
+          <w:p>
+            <w:r>
+              <w:t>мобильное приложение</w:t>
+            </w:r>
+          </w:p>
+        </w:tc>
+      </w:tr>
+    </w:tbl>
+    <w:p/>
+    <w:p>
+      <w:r>
+        <w:t>Список для копирования (имена площадок):</w:t>
+      </w:r>
+    </w:p>
+    <w:p/>
+    <w:p>
+      <w:r>
+        <w:rPr>
+          <w:rFonts w:ascii="Consolas" w:hAnsi="Consolas"/>
+        </w:rPr>
+        <w:t>dzen.ru</w:t>
+        <w:br/>
+        <w:t>kidultlovin.word.zen</w:t>
+        <w:br/>
+        <w:t>yandex.ru</w:t>
+        <w:br/>
+        <w:t>com.oakever.tiletrip</w:t>
+        <w:br/>
+        <w:t>com.dream.free.games.match3</w:t>
+        <w:br/>
+        <w:t>m.pogoda.yandex.ru</w:t>
+        <w:br/>
+        <w:t>ru.yandex.weatherplugin</w:t>
+        <w:br/>
+        <w:t>puzzle.blockpuzzle.cube.relax</w:t>
+        <w:br/>
+        <w:t>com.miui.cleaner</w:t>
+        <w:br/>
+        <w:t>com.vkontakte.android</w:t>
+        <w:br/>
+        <w:t>ex.24smi.info</w:t>
+        <w:br/>
+        <w:t>news.mail.ru</w:t>
+        <w:br/>
+        <w:t>com.fingerlab.word.blockpuzzles</w:t>
+        <w:br/>
+        <w:t>com.starplay.spider.fighter.openworld</w:t>
+        <w:br/>
+        <w:t>win.mail.ru</w:t>
+        <w:br/>
+        <w:t>com.avito.android</w:t>
+      </w:r>
+    </w:p>
+    <w:p>
+      <w:pPr>
+        <w:pStyle w:val="Heading2"/>
+      </w:pPr>
+      <w:r>
+        <w:t>9.7. Настройки (кратко)</w:t>
+      </w:r>
+    </w:p>
+    <w:p>
+      <w:pPr>
+        <w:pStyle w:val="ListBullet"/>
+      </w:pPr>
+      <w:r>
+        <w:t>Поиск: фразовое + точное соответствие; не полагаться только на автотаргет.</w:t>
+      </w:r>
+    </w:p>
+    <w:p>
+      <w:pPr>
+        <w:pStyle w:val="ListBullet"/>
+      </w:pPr>
+      <w:r>
+        <w:t>Сети: отдельная кампания с низким бюджетом или отключить до настройки поиска.</w:t>
+      </w:r>
+    </w:p>
+    <w:p>
+      <w:pPr>
+        <w:pStyle w:val="ListBullet"/>
+      </w:pPr>
+      <w:r>
+        <w:t>После добавления минус-слов — повторный анализ через 7–14 дней по новой выгрузке.</w:t>
       </w:r>
     </w:p>
     <w:sectPr>

</xml_diff>